<commit_message>
UT doc: add new payroll override screenshots against ACs and objects table
Co-Authored-By: Claude Opus 5.5 <noreply@anthropic.com>
Claude-Session: https://claude.ai/code/session_0133ThWkzJvybTMDN5JKwRhb
</commit_message>
<xml_diff>
--- a/Payroll_Override_Offline_UT.docx
+++ b/Payroll_Override_Offline_UT.docx
@@ -81,7 +81,7 @@
           <wp:inline distT="0" distB="0" distL="0" distR="0">
             <wp:extent cx="2476500" cy="3200400"/>
             <wp:effectExtent t="0" r="0" b="0" l="0"/>
-            <wp:docPr id="1" name="shot11" descr="Screenshot 11" title="Screenshot 11"/>
+            <wp:docPr id="201" name="shot11" descr="Screenshot 11" title="Screenshot 11"/>
             <wp:cNvGraphicFramePr>
               <a:graphicFrameLocks xmlns:a="http://schemas.openxmlformats.org/drawingml/2006/main" noChangeAspect="1"/>
             </wp:cNvGraphicFramePr>
@@ -126,7 +126,7 @@
           <wp:inline distT="0" distB="0" distL="0" distR="0">
             <wp:extent cx="5715000" cy="2428875"/>
             <wp:effectExtent t="0" r="0" b="0" l="0"/>
-            <wp:docPr id="1" name="shot9" descr="Screenshot 9" title="Screenshot 9"/>
+            <wp:docPr id="202" name="shot9" descr="Screenshot 9" title="Screenshot 9"/>
             <wp:cNvGraphicFramePr>
               <a:graphicFrameLocks xmlns:a="http://schemas.openxmlformats.org/drawingml/2006/main" noChangeAspect="1"/>
             </wp:cNvGraphicFramePr>
@@ -164,6 +164,141 @@
     </w:p>
     <w:p>
       <w:pPr>
+        <w:spacing w:after="160" w:before="160"/>
+      </w:pPr>
+      <w:r>
+        <w:drawing>
+          <wp:inline distT="0" distB="0" distL="0" distR="0">
+            <wp:extent cx="2476500" cy="4404476"/>
+            <wp:effectExtent t="0" r="0" b="0" l="0"/>
+            <wp:docPr id="100" name="shotnew1" descr="Screenshot new 1" title="Screenshot new 1"/>
+            <wp:cNvGraphicFramePr>
+              <a:graphicFrameLocks xmlns:a="http://schemas.openxmlformats.org/drawingml/2006/main" noChangeAspect="1"/>
+            </wp:cNvGraphicFramePr>
+            <a:graphic xmlns:a="http://schemas.openxmlformats.org/drawingml/2006/main">
+              <a:graphicData uri="http://schemas.openxmlformats.org/drawingml/2006/picture">
+                <pic:pic xmlns:pic="http://schemas.openxmlformats.org/drawingml/2006/picture">
+                  <pic:nvPicPr>
+                    <pic:cNvPr id="0" name="" descr=""/>
+                    <pic:cNvPicPr>
+                      <a:picLocks noChangeAspect="1" noChangeArrowheads="1"/>
+                    </pic:cNvPicPr>
+                  </pic:nvPicPr>
+                  <pic:blipFill>
+                    <a:blip r:embed="rId100" cstate="none"/>
+                    <a:srcRect/>
+                    <a:stretch>
+                      <a:fillRect/>
+                    </a:stretch>
+                  </pic:blipFill>
+                  <pic:spPr bwMode="auto">
+                    <a:xfrm>
+                      <a:off x="0" y="0"/>
+                      <a:ext cx="2476500" cy="4404476"/>
+                    </a:xfrm>
+                    <a:prstGeom prst="rect">
+                      <a:avLst/>
+                    </a:prstGeom>
+                  </pic:spPr>
+                </pic:pic>
+              </a:graphicData>
+            </a:graphic>
+          </wp:inline>
+        </w:drawing>
+      </w:r>
+    </w:p>
+    <w:p>
+      <w:pPr>
+        <w:spacing w:after="160" w:before="160"/>
+      </w:pPr>
+      <w:r>
+        <w:drawing>
+          <wp:inline distT="0" distB="0" distL="0" distR="0">
+            <wp:extent cx="2476500" cy="4485940"/>
+            <wp:effectExtent t="0" r="0" b="0" l="0"/>
+            <wp:docPr id="101" name="shotnew2" descr="Screenshot new 2" title="Screenshot new 2"/>
+            <wp:cNvGraphicFramePr>
+              <a:graphicFrameLocks xmlns:a="http://schemas.openxmlformats.org/drawingml/2006/main" noChangeAspect="1"/>
+            </wp:cNvGraphicFramePr>
+            <a:graphic xmlns:a="http://schemas.openxmlformats.org/drawingml/2006/main">
+              <a:graphicData uri="http://schemas.openxmlformats.org/drawingml/2006/picture">
+                <pic:pic xmlns:pic="http://schemas.openxmlformats.org/drawingml/2006/picture">
+                  <pic:nvPicPr>
+                    <pic:cNvPr id="0" name="" descr=""/>
+                    <pic:cNvPicPr>
+                      <a:picLocks noChangeAspect="1" noChangeArrowheads="1"/>
+                    </pic:cNvPicPr>
+                  </pic:nvPicPr>
+                  <pic:blipFill>
+                    <a:blip r:embed="rId101" cstate="none"/>
+                    <a:srcRect/>
+                    <a:stretch>
+                      <a:fillRect/>
+                    </a:stretch>
+                  </pic:blipFill>
+                  <pic:spPr bwMode="auto">
+                    <a:xfrm>
+                      <a:off x="0" y="0"/>
+                      <a:ext cx="2476500" cy="4485940"/>
+                    </a:xfrm>
+                    <a:prstGeom prst="rect">
+                      <a:avLst/>
+                    </a:prstGeom>
+                  </pic:spPr>
+                </pic:pic>
+              </a:graphicData>
+            </a:graphic>
+          </wp:inline>
+        </w:drawing>
+      </w:r>
+    </w:p>
+    <w:p>
+      <w:pPr>
+        <w:spacing w:after="160" w:before="160"/>
+      </w:pPr>
+      <w:r>
+        <w:drawing>
+          <wp:inline distT="0" distB="0" distL="0" distR="0">
+            <wp:extent cx="2476500" cy="4699590"/>
+            <wp:effectExtent t="0" r="0" b="0" l="0"/>
+            <wp:docPr id="103" name="shotnew4" descr="Screenshot new 4" title="Screenshot new 4"/>
+            <wp:cNvGraphicFramePr>
+              <a:graphicFrameLocks xmlns:a="http://schemas.openxmlformats.org/drawingml/2006/main" noChangeAspect="1"/>
+            </wp:cNvGraphicFramePr>
+            <a:graphic xmlns:a="http://schemas.openxmlformats.org/drawingml/2006/main">
+              <a:graphicData uri="http://schemas.openxmlformats.org/drawingml/2006/picture">
+                <pic:pic xmlns:pic="http://schemas.openxmlformats.org/drawingml/2006/picture">
+                  <pic:nvPicPr>
+                    <pic:cNvPr id="0" name="" descr=""/>
+                    <pic:cNvPicPr>
+                      <a:picLocks noChangeAspect="1" noChangeArrowheads="1"/>
+                    </pic:cNvPicPr>
+                  </pic:nvPicPr>
+                  <pic:blipFill>
+                    <a:blip r:embed="rId103" cstate="none"/>
+                    <a:srcRect/>
+                    <a:stretch>
+                      <a:fillRect/>
+                    </a:stretch>
+                  </pic:blipFill>
+                  <pic:spPr bwMode="auto">
+                    <a:xfrm>
+                      <a:off x="0" y="0"/>
+                      <a:ext cx="2476500" cy="4699590"/>
+                    </a:xfrm>
+                    <a:prstGeom prst="rect">
+                      <a:avLst/>
+                    </a:prstGeom>
+                  </pic:spPr>
+                </pic:pic>
+              </a:graphicData>
+            </a:graphic>
+          </wp:inline>
+        </w:drawing>
+      </w:r>
+    </w:p>
+    <w:p>
+      <w:pPr>
         <w:pStyle w:val="Heading1"/>
         <w:spacing w:after="120" w:before="360"/>
       </w:pPr>
@@ -196,7 +331,7 @@
           <wp:inline distT="0" distB="0" distL="0" distR="0">
             <wp:extent cx="5715000" cy="2466975"/>
             <wp:effectExtent t="0" r="0" b="0" l="0"/>
-            <wp:docPr id="1" name="shot14" descr="Screenshot 14" title="Screenshot 14"/>
+            <wp:docPr id="203" name="shot14" descr="Screenshot 14" title="Screenshot 14"/>
             <wp:cNvGraphicFramePr>
               <a:graphicFrameLocks xmlns:a="http://schemas.openxmlformats.org/drawingml/2006/main" noChangeAspect="1"/>
             </wp:cNvGraphicFramePr>
@@ -241,7 +376,7 @@
           <wp:inline distT="0" distB="0" distL="0" distR="0">
             <wp:extent cx="2476500" cy="4381500"/>
             <wp:effectExtent t="0" r="0" b="0" l="0"/>
-            <wp:docPr id="1" name="shot13" descr="Screenshot 13" title="Screenshot 13"/>
+            <wp:docPr id="204" name="shot13" descr="Screenshot 13" title="Screenshot 13"/>
             <wp:cNvGraphicFramePr>
               <a:graphicFrameLocks xmlns:a="http://schemas.openxmlformats.org/drawingml/2006/main" noChangeAspect="1"/>
             </wp:cNvGraphicFramePr>
@@ -279,6 +414,51 @@
     </w:p>
     <w:p>
       <w:pPr>
+        <w:spacing w:after="160" w:before="160"/>
+      </w:pPr>
+      <w:r>
+        <w:drawing>
+          <wp:inline distT="0" distB="0" distL="0" distR="0">
+            <wp:extent cx="2476500" cy="4404476"/>
+            <wp:effectExtent t="0" r="0" b="0" l="0"/>
+            <wp:docPr id="205" name="shotnew1" descr="Screenshot new 1" title="Screenshot new 1"/>
+            <wp:cNvGraphicFramePr>
+              <a:graphicFrameLocks xmlns:a="http://schemas.openxmlformats.org/drawingml/2006/main" noChangeAspect="1"/>
+            </wp:cNvGraphicFramePr>
+            <a:graphic xmlns:a="http://schemas.openxmlformats.org/drawingml/2006/main">
+              <a:graphicData uri="http://schemas.openxmlformats.org/drawingml/2006/picture">
+                <pic:pic xmlns:pic="http://schemas.openxmlformats.org/drawingml/2006/picture">
+                  <pic:nvPicPr>
+                    <pic:cNvPr id="0" name="" descr=""/>
+                    <pic:cNvPicPr>
+                      <a:picLocks noChangeAspect="1" noChangeArrowheads="1"/>
+                    </pic:cNvPicPr>
+                  </pic:nvPicPr>
+                  <pic:blipFill>
+                    <a:blip r:embed="rId100" cstate="none"/>
+                    <a:srcRect/>
+                    <a:stretch>
+                      <a:fillRect/>
+                    </a:stretch>
+                  </pic:blipFill>
+                  <pic:spPr bwMode="auto">
+                    <a:xfrm>
+                      <a:off x="0" y="0"/>
+                      <a:ext cx="2476500" cy="4404476"/>
+                    </a:xfrm>
+                    <a:prstGeom prst="rect">
+                      <a:avLst/>
+                    </a:prstGeom>
+                  </pic:spPr>
+                </pic:pic>
+              </a:graphicData>
+            </a:graphic>
+          </wp:inline>
+        </w:drawing>
+      </w:r>
+    </w:p>
+    <w:p>
+      <w:pPr>
         <w:pStyle w:val="Heading1"/>
         <w:spacing w:after="120" w:before="360"/>
       </w:pPr>
@@ -311,7 +491,7 @@
           <wp:inline distT="0" distB="0" distL="0" distR="0">
             <wp:extent cx="5715000" cy="2724150"/>
             <wp:effectExtent t="0" r="0" b="0" l="0"/>
-            <wp:docPr id="1" name="shot15" descr="Screenshot 15" title="Screenshot 15"/>
+            <wp:docPr id="206" name="shot15" descr="Screenshot 15" title="Screenshot 15"/>
             <wp:cNvGraphicFramePr>
               <a:graphicFrameLocks xmlns:a="http://schemas.openxmlformats.org/drawingml/2006/main" noChangeAspect="1"/>
             </wp:cNvGraphicFramePr>
@@ -356,7 +536,7 @@
           <wp:inline distT="0" distB="0" distL="0" distR="0">
             <wp:extent cx="2476500" cy="6848475"/>
             <wp:effectExtent t="0" r="0" b="0" l="0"/>
-            <wp:docPr id="1" name="shot16" descr="Screenshot 16" title="Screenshot 16"/>
+            <wp:docPr id="207" name="shot16" descr="Screenshot 16" title="Screenshot 16"/>
             <wp:cNvGraphicFramePr>
               <a:graphicFrameLocks xmlns:a="http://schemas.openxmlformats.org/drawingml/2006/main" noChangeAspect="1"/>
             </wp:cNvGraphicFramePr>
@@ -418,7 +598,7 @@
           <wp:inline distT="0" distB="0" distL="0" distR="0">
             <wp:extent cx="5715000" cy="5905500"/>
             <wp:effectExtent t="0" r="0" b="0" l="0"/>
-            <wp:docPr id="1" name="shot12" descr="Screenshot 12" title="Screenshot 12"/>
+            <wp:docPr id="208" name="shot12" descr="Screenshot 12" title="Screenshot 12"/>
             <wp:cNvGraphicFramePr>
               <a:graphicFrameLocks xmlns:a="http://schemas.openxmlformats.org/drawingml/2006/main" noChangeAspect="1"/>
             </wp:cNvGraphicFramePr>
@@ -463,7 +643,7 @@
           <wp:inline distT="0" distB="0" distL="0" distR="0">
             <wp:extent cx="5715000" cy="2428875"/>
             <wp:effectExtent t="0" r="0" b="0" l="0"/>
-            <wp:docPr id="1" name="shot9" descr="Screenshot 9" title="Screenshot 9"/>
+            <wp:docPr id="209" name="shot9" descr="Screenshot 9" title="Screenshot 9"/>
             <wp:cNvGraphicFramePr>
               <a:graphicFrameLocks xmlns:a="http://schemas.openxmlformats.org/drawingml/2006/main" noChangeAspect="1"/>
             </wp:cNvGraphicFramePr>
@@ -501,6 +681,96 @@
     </w:p>
     <w:p>
       <w:pPr>
+        <w:spacing w:after="160" w:before="160"/>
+      </w:pPr>
+      <w:r>
+        <w:drawing>
+          <wp:inline distT="0" distB="0" distL="0" distR="0">
+            <wp:extent cx="2476500" cy="3170845"/>
+            <wp:effectExtent t="0" r="0" b="0" l="0"/>
+            <wp:docPr id="102" name="shotnew3" descr="Screenshot new 3" title="Screenshot new 3"/>
+            <wp:cNvGraphicFramePr>
+              <a:graphicFrameLocks xmlns:a="http://schemas.openxmlformats.org/drawingml/2006/main" noChangeAspect="1"/>
+            </wp:cNvGraphicFramePr>
+            <a:graphic xmlns:a="http://schemas.openxmlformats.org/drawingml/2006/main">
+              <a:graphicData uri="http://schemas.openxmlformats.org/drawingml/2006/picture">
+                <pic:pic xmlns:pic="http://schemas.openxmlformats.org/drawingml/2006/picture">
+                  <pic:nvPicPr>
+                    <pic:cNvPr id="0" name="" descr=""/>
+                    <pic:cNvPicPr>
+                      <a:picLocks noChangeAspect="1" noChangeArrowheads="1"/>
+                    </pic:cNvPicPr>
+                  </pic:nvPicPr>
+                  <pic:blipFill>
+                    <a:blip r:embed="rId102" cstate="none"/>
+                    <a:srcRect/>
+                    <a:stretch>
+                      <a:fillRect/>
+                    </a:stretch>
+                  </pic:blipFill>
+                  <pic:spPr bwMode="auto">
+                    <a:xfrm>
+                      <a:off x="0" y="0"/>
+                      <a:ext cx="2476500" cy="3170845"/>
+                    </a:xfrm>
+                    <a:prstGeom prst="rect">
+                      <a:avLst/>
+                    </a:prstGeom>
+                  </pic:spPr>
+                </pic:pic>
+              </a:graphicData>
+            </a:graphic>
+          </wp:inline>
+        </w:drawing>
+      </w:r>
+    </w:p>
+    <w:p>
+      <w:pPr>
+        <w:spacing w:after="160" w:before="160"/>
+      </w:pPr>
+      <w:r>
+        <w:drawing>
+          <wp:inline distT="0" distB="0" distL="0" distR="0">
+            <wp:extent cx="2476500" cy="4699590"/>
+            <wp:effectExtent t="0" r="0" b="0" l="0"/>
+            <wp:docPr id="210" name="shotnew4" descr="Screenshot new 4" title="Screenshot new 4"/>
+            <wp:cNvGraphicFramePr>
+              <a:graphicFrameLocks xmlns:a="http://schemas.openxmlformats.org/drawingml/2006/main" noChangeAspect="1"/>
+            </wp:cNvGraphicFramePr>
+            <a:graphic xmlns:a="http://schemas.openxmlformats.org/drawingml/2006/main">
+              <a:graphicData uri="http://schemas.openxmlformats.org/drawingml/2006/picture">
+                <pic:pic xmlns:pic="http://schemas.openxmlformats.org/drawingml/2006/picture">
+                  <pic:nvPicPr>
+                    <pic:cNvPr id="0" name="" descr=""/>
+                    <pic:cNvPicPr>
+                      <a:picLocks noChangeAspect="1" noChangeArrowheads="1"/>
+                    </pic:cNvPicPr>
+                  </pic:nvPicPr>
+                  <pic:blipFill>
+                    <a:blip r:embed="rId103" cstate="none"/>
+                    <a:srcRect/>
+                    <a:stretch>
+                      <a:fillRect/>
+                    </a:stretch>
+                  </pic:blipFill>
+                  <pic:spPr bwMode="auto">
+                    <a:xfrm>
+                      <a:off x="0" y="0"/>
+                      <a:ext cx="2476500" cy="4699590"/>
+                    </a:xfrm>
+                    <a:prstGeom prst="rect">
+                      <a:avLst/>
+                    </a:prstGeom>
+                  </pic:spPr>
+                </pic:pic>
+              </a:graphicData>
+            </a:graphic>
+          </wp:inline>
+        </w:drawing>
+      </w:r>
+    </w:p>
+    <w:p>
+      <w:pPr>
         <w:pStyle w:val="Heading1"/>
         <w:spacing w:after="120" w:before="360"/>
       </w:pPr>
@@ -525,7 +795,7 @@
           <wp:inline distT="0" distB="0" distL="0" distR="0">
             <wp:extent cx="2476500" cy="4381500"/>
             <wp:effectExtent t="0" r="0" b="0" l="0"/>
-            <wp:docPr id="1" name="shot13" descr="Screenshot 13" title="Screenshot 13"/>
+            <wp:docPr id="211" name="shot13" descr="Screenshot 13" title="Screenshot 13"/>
             <wp:cNvGraphicFramePr>
               <a:graphicFrameLocks xmlns:a="http://schemas.openxmlformats.org/drawingml/2006/main" noChangeAspect="1"/>
             </wp:cNvGraphicFramePr>
@@ -561,6 +831,621 @@
         </w:drawing>
       </w:r>
     </w:p>
+    <w:p>
+      <w:pPr>
+        <w:pStyle w:val="Heading1"/>
+        <w:spacing w:after="120" w:before="360"/>
+      </w:pPr>
+      <w:r>
+        <w:t xml:space="preserve">Objects</w:t>
+      </w:r>
+    </w:p>
+    <w:tbl>
+      <w:tblPr>
+        <w:tblW w:w="9360" w:type="dxa"/>
+        <w:tblBorders>
+          <w:top w:val="single" w:sz="4" w:space="0" w:color="A6A6A6"/>
+          <w:left w:val="single" w:sz="4" w:space="0" w:color="A6A6A6"/>
+          <w:bottom w:val="single" w:sz="4" w:space="0" w:color="A6A6A6"/>
+          <w:right w:val="single" w:sz="4" w:space="0" w:color="A6A6A6"/>
+          <w:insideH w:val="single" w:sz="4" w:space="0" w:color="A6A6A6"/>
+          <w:insideV w:val="single" w:sz="4" w:space="0" w:color="A6A6A6"/>
+        </w:tblBorders>
+        <w:tblLayout w:type="fixed"/>
+      </w:tblPr>
+      <w:tblGrid>
+        <w:gridCol w:w="3600"/>
+        <w:gridCol w:w="1560"/>
+        <w:gridCol w:w="4200"/>
+      </w:tblGrid>
+      <w:tr>
+        <w:tc>
+          <w:tcPr>
+            <w:tcW w:w="3600" w:type="dxa"/>
+            <w:shd w:val="clear" w:color="auto" w:fill="D9E2F3"/>
+          </w:tcPr>
+          <w:p>
+            <w:pPr>
+              <w:spacing w:before="40" w:after="40"/>
+            </w:pPr>
+            <w:r>
+              <w:rPr>
+                <w:b/>
+              </w:rPr>
+              <w:t xml:space="preserve">Name</w:t>
+            </w:r>
+          </w:p>
+        </w:tc>
+        <w:tc>
+          <w:tcPr>
+            <w:tcW w:w="1560" w:type="dxa"/>
+            <w:shd w:val="clear" w:color="auto" w:fill="D9E2F3"/>
+          </w:tcPr>
+          <w:p>
+            <w:pPr>
+              <w:spacing w:before="40" w:after="40"/>
+            </w:pPr>
+            <w:r>
+              <w:rPr>
+                <w:b/>
+              </w:rPr>
+              <w:t xml:space="preserve">Type</w:t>
+            </w:r>
+          </w:p>
+        </w:tc>
+        <w:tc>
+          <w:tcPr>
+            <w:tcW w:w="4200" w:type="dxa"/>
+            <w:shd w:val="clear" w:color="auto" w:fill="D9E2F3"/>
+          </w:tcPr>
+          <w:p>
+            <w:pPr>
+              <w:spacing w:before="40" w:after="40"/>
+            </w:pPr>
+            <w:r>
+              <w:rPr>
+                <w:b/>
+              </w:rPr>
+              <w:t xml:space="preserve">Description</w:t>
+            </w:r>
+          </w:p>
+        </w:tc>
+      </w:tr>
+      <w:tr>
+        <w:tc>
+          <w:tcPr>
+            <w:tcW w:w="3600" w:type="dxa"/>
+          </w:tcPr>
+          <w:p>
+            <w:pPr>
+              <w:spacing w:before="40" w:after="40"/>
+            </w:pPr>
+            <w:r>
+              <w:t xml:space="preserve">ATE_SEC_peopleTabForMteOfflineAppPage3</w:t>
+            </w:r>
+          </w:p>
+        </w:tc>
+        <w:tc>
+          <w:tcPr>
+            <w:tcW w:w="1560" w:type="dxa"/>
+          </w:tcPr>
+          <w:p>
+            <w:pPr>
+              <w:spacing w:before="40" w:after="40"/>
+            </w:pPr>
+            <w:r>
+              <w:t xml:space="preserve">Interface</w:t>
+            </w:r>
+          </w:p>
+        </w:tc>
+        <w:tc>
+          <w:tcPr>
+            <w:tcW w:w="4200" w:type="dxa"/>
+          </w:tcPr>
+          <w:p>
+            <w:pPr>
+              <w:spacing w:before="40" w:after="40"/>
+            </w:pPr>
+            <w:r>
+              <w:t xml:space="preserve">People tab for the selected work order on MTE Offline page 3</w:t>
+            </w:r>
+          </w:p>
+        </w:tc>
+      </w:tr>
+      <w:tr>
+        <w:tc>
+          <w:tcPr>
+            <w:tcW w:w="3600" w:type="dxa"/>
+          </w:tcPr>
+          <w:p>
+            <w:pPr>
+              <w:spacing w:before="40" w:after="40"/>
+            </w:pPr>
+            <w:r>
+              <w:t xml:space="preserve">ATE_FRM_mteOfflinePageWrapper</w:t>
+            </w:r>
+          </w:p>
+        </w:tc>
+        <w:tc>
+          <w:tcPr>
+            <w:tcW w:w="1560" w:type="dxa"/>
+          </w:tcPr>
+          <w:p>
+            <w:pPr>
+              <w:spacing w:before="40" w:after="40"/>
+            </w:pPr>
+            <w:r>
+              <w:t xml:space="preserve">Interface</w:t>
+            </w:r>
+          </w:p>
+        </w:tc>
+        <w:tc>
+          <w:tcPr>
+            <w:tcW w:w="4200" w:type="dxa"/>
+          </w:tcPr>
+          <w:p>
+            <w:pPr>
+              <w:spacing w:before="40" w:after="40"/>
+            </w:pPr>
+            <w:r>
+              <w:t xml:space="preserve">Wrapper interface for the MTE Offline page</w:t>
+            </w:r>
+          </w:p>
+        </w:tc>
+      </w:tr>
+      <w:tr>
+        <w:tc>
+          <w:tcPr>
+            <w:tcW w:w="3600" w:type="dxa"/>
+          </w:tcPr>
+          <w:p>
+            <w:pPr>
+              <w:spacing w:before="40" w:after="40"/>
+            </w:pPr>
+            <w:r>
+              <w:t xml:space="preserve">ATE_constructContractorTimesheetForMteOffline</w:t>
+            </w:r>
+          </w:p>
+        </w:tc>
+        <w:tc>
+          <w:tcPr>
+            <w:tcW w:w="1560" w:type="dxa"/>
+          </w:tcPr>
+          <w:p>
+            <w:pPr>
+              <w:spacing w:before="40" w:after="40"/>
+            </w:pPr>
+            <w:r>
+              <w:t xml:space="preserve">Expression Rule</w:t>
+            </w:r>
+          </w:p>
+        </w:tc>
+        <w:tc>
+          <w:tcPr>
+            <w:tcW w:w="4200" w:type="dxa"/>
+          </w:tcPr>
+          <w:p>
+            <w:pPr>
+              <w:spacing w:before="40" w:after="40"/>
+            </w:pPr>
+            <w:r>
+              <w:t xml:space="preserve">Constructs the contractor timesheet record from the map built for MTE Offline</w:t>
+            </w:r>
+          </w:p>
+        </w:tc>
+      </w:tr>
+      <w:tr>
+        <w:tc>
+          <w:tcPr>
+            <w:tcW w:w="3600" w:type="dxa"/>
+          </w:tcPr>
+          <w:p>
+            <w:pPr>
+              <w:spacing w:before="40" w:after="40"/>
+            </w:pPr>
+            <w:r>
+              <w:t xml:space="preserve">ATE_SCT_mteOfflineAppPage3</w:t>
+            </w:r>
+          </w:p>
+        </w:tc>
+        <w:tc>
+          <w:tcPr>
+            <w:tcW w:w="1560" w:type="dxa"/>
+          </w:tcPr>
+          <w:p>
+            <w:pPr>
+              <w:spacing w:before="40" w:after="40"/>
+            </w:pPr>
+            <w:r>
+              <w:t xml:space="preserve">Interface</w:t>
+            </w:r>
+          </w:p>
+        </w:tc>
+        <w:tc>
+          <w:tcPr>
+            <w:tcW w:w="4200" w:type="dxa"/>
+          </w:tcPr>
+          <w:p>
+            <w:pPr>
+              <w:spacing w:before="40" w:after="40"/>
+            </w:pPr>
+            <w:r>
+              <w:t xml:space="preserve">MTE Offline screen for Page 3</w:t>
+            </w:r>
+          </w:p>
+        </w:tc>
+      </w:tr>
+      <w:tr>
+        <w:tc>
+          <w:tcPr>
+            <w:tcW w:w="3600" w:type="dxa"/>
+          </w:tcPr>
+          <w:p>
+            <w:pPr>
+              <w:spacing w:before="40" w:after="40"/>
+            </w:pPr>
+            <w:r>
+              <w:t xml:space="preserve">ATE_UTIL_offlineapplypayrolloverride</w:t>
+            </w:r>
+          </w:p>
+        </w:tc>
+        <w:tc>
+          <w:tcPr>
+            <w:tcW w:w="1560" w:type="dxa"/>
+          </w:tcPr>
+          <w:p>
+            <w:pPr>
+              <w:spacing w:before="40" w:after="40"/>
+            </w:pPr>
+            <w:r>
+              <w:t xml:space="preserve">Expression Rule</w:t>
+            </w:r>
+          </w:p>
+        </w:tc>
+        <w:tc>
+          <w:tcPr>
+            <w:tcW w:w="4200" w:type="dxa"/>
+          </w:tcPr>
+          <w:p>
+            <w:pPr>
+              <w:spacing w:before="40" w:after="40"/>
+            </w:pPr>
+            <w:r>
+              <w:t xml:space="preserve">Applies the payroll override category and rate to an employee's hour types</w:t>
+            </w:r>
+          </w:p>
+        </w:tc>
+      </w:tr>
+      <w:tr>
+        <w:tc>
+          <w:tcPr>
+            <w:tcW w:w="3600" w:type="dxa"/>
+          </w:tcPr>
+          <w:p>
+            <w:pPr>
+              <w:spacing w:before="40" w:after="40"/>
+            </w:pPr>
+            <w:r>
+              <w:t xml:space="preserve">ATE_UTIL_offlineSetEquipmentPayrollRateOverrides</w:t>
+            </w:r>
+          </w:p>
+        </w:tc>
+        <w:tc>
+          <w:tcPr>
+            <w:tcW w:w="1560" w:type="dxa"/>
+          </w:tcPr>
+          <w:p>
+            <w:pPr>
+              <w:spacing w:before="40" w:after="40"/>
+            </w:pPr>
+            <w:r>
+              <w:t xml:space="preserve">Expression Rule</w:t>
+            </w:r>
+          </w:p>
+        </w:tc>
+        <w:tc>
+          <w:tcPr>
+            <w:tcW w:w="4200" w:type="dxa"/>
+          </w:tcPr>
+          <w:p>
+            <w:pPr>
+              <w:spacing w:before="40" w:after="40"/>
+            </w:pPr>
+            <w:r>
+              <w:t xml:space="preserve">Sets the payroll override category and rate for one equipment row</w:t>
+            </w:r>
+          </w:p>
+        </w:tc>
+      </w:tr>
+      <w:tr>
+        <w:tc>
+          <w:tcPr>
+            <w:tcW w:w="3600" w:type="dxa"/>
+          </w:tcPr>
+          <w:p>
+            <w:pPr>
+              <w:spacing w:before="40" w:after="40"/>
+            </w:pPr>
+            <w:r>
+              <w:t xml:space="preserve">ATE_UTIL_offlineSetLaborPayrollRateOverride</w:t>
+            </w:r>
+          </w:p>
+        </w:tc>
+        <w:tc>
+          <w:tcPr>
+            <w:tcW w:w="1560" w:type="dxa"/>
+          </w:tcPr>
+          <w:p>
+            <w:pPr>
+              <w:spacing w:before="40" w:after="40"/>
+            </w:pPr>
+            <w:r>
+              <w:t xml:space="preserve">Expression Rule</w:t>
+            </w:r>
+          </w:p>
+        </w:tc>
+        <w:tc>
+          <w:tcPr>
+            <w:tcW w:w="4200" w:type="dxa"/>
+          </w:tcPr>
+          <w:p>
+            <w:pPr>
+              <w:spacing w:before="40" w:after="40"/>
+            </w:pPr>
+            <w:r>
+              <w:t xml:space="preserve">Sets the payroll override category and rate for one labor row</w:t>
+            </w:r>
+          </w:p>
+        </w:tc>
+      </w:tr>
+      <w:tr>
+        <w:tc>
+          <w:tcPr>
+            <w:tcW w:w="3600" w:type="dxa"/>
+          </w:tcPr>
+          <w:p>
+            <w:pPr>
+              <w:spacing w:before="40" w:after="40"/>
+            </w:pPr>
+            <w:r>
+              <w:t xml:space="preserve">ATE_UTIL_offlineCopyPreviousDayPayrollOverride</w:t>
+            </w:r>
+          </w:p>
+        </w:tc>
+        <w:tc>
+          <w:tcPr>
+            <w:tcW w:w="1560" w:type="dxa"/>
+          </w:tcPr>
+          <w:p>
+            <w:pPr>
+              <w:spacing w:before="40" w:after="40"/>
+            </w:pPr>
+            <w:r>
+              <w:t xml:space="preserve">Expression Rule</w:t>
+            </w:r>
+          </w:p>
+        </w:tc>
+        <w:tc>
+          <w:tcPr>
+            <w:tcW w:w="4200" w:type="dxa"/>
+          </w:tcPr>
+          <w:p>
+            <w:pPr>
+              <w:spacing w:before="40" w:after="40"/>
+            </w:pPr>
+            <w:r>
+              <w:t xml:space="preserve">Copies the previous day's payroll override into the selected day (weekly)</w:t>
+            </w:r>
+          </w:p>
+        </w:tc>
+      </w:tr>
+      <w:tr>
+        <w:tc>
+          <w:tcPr>
+            <w:tcW w:w="3600" w:type="dxa"/>
+          </w:tcPr>
+          <w:p>
+            <w:pPr>
+              <w:spacing w:before="40" w:after="40"/>
+            </w:pPr>
+            <w:r>
+              <w:t xml:space="preserve">ATE_SEC_offlineEquipmentPayrollOverride</w:t>
+            </w:r>
+          </w:p>
+        </w:tc>
+        <w:tc>
+          <w:tcPr>
+            <w:tcW w:w="1560" w:type="dxa"/>
+          </w:tcPr>
+          <w:p>
+            <w:pPr>
+              <w:spacing w:before="40" w:after="40"/>
+            </w:pPr>
+            <w:r>
+              <w:t xml:space="preserve">Interface</w:t>
+            </w:r>
+          </w:p>
+        </w:tc>
+        <w:tc>
+          <w:tcPr>
+            <w:tcW w:w="4200" w:type="dxa"/>
+          </w:tcPr>
+          <w:p>
+            <w:pPr>
+              <w:spacing w:before="40" w:after="40"/>
+            </w:pPr>
+            <w:r>
+              <w:t xml:space="preserve">MTE Offline equipment payroll override section</w:t>
+            </w:r>
+          </w:p>
+        </w:tc>
+      </w:tr>
+      <w:tr>
+        <w:tc>
+          <w:tcPr>
+            <w:tcW w:w="3600" w:type="dxa"/>
+          </w:tcPr>
+          <w:p>
+            <w:pPr>
+              <w:spacing w:before="40" w:after="40"/>
+            </w:pPr>
+            <w:r>
+              <w:t xml:space="preserve">ATE_UTIL_offlineGetPreviousDayPayrollOverride</w:t>
+            </w:r>
+          </w:p>
+        </w:tc>
+        <w:tc>
+          <w:tcPr>
+            <w:tcW w:w="1560" w:type="dxa"/>
+          </w:tcPr>
+          <w:p>
+            <w:pPr>
+              <w:spacing w:before="40" w:after="40"/>
+            </w:pPr>
+            <w:r>
+              <w:t xml:space="preserve">Expression Rule</w:t>
+            </w:r>
+          </w:p>
+        </w:tc>
+        <w:tc>
+          <w:tcPr>
+            <w:tcW w:w="4200" w:type="dxa"/>
+          </w:tcPr>
+          <w:p>
+            <w:pPr>
+              <w:spacing w:before="40" w:after="40"/>
+            </w:pPr>
+            <w:r>
+              <w:t xml:space="preserve">Gets the previous day's payroll override for the same employee/equipment (weekly)</w:t>
+            </w:r>
+          </w:p>
+        </w:tc>
+      </w:tr>
+      <w:tr>
+        <w:tc>
+          <w:tcPr>
+            <w:tcW w:w="3600" w:type="dxa"/>
+          </w:tcPr>
+          <w:p>
+            <w:pPr>
+              <w:spacing w:before="40" w:after="40"/>
+            </w:pPr>
+            <w:r>
+              <w:t xml:space="preserve">ATE_SEC_offlineLaborPayrollOverride</w:t>
+            </w:r>
+          </w:p>
+        </w:tc>
+        <w:tc>
+          <w:tcPr>
+            <w:tcW w:w="1560" w:type="dxa"/>
+          </w:tcPr>
+          <w:p>
+            <w:pPr>
+              <w:spacing w:before="40" w:after="40"/>
+            </w:pPr>
+            <w:r>
+              <w:t xml:space="preserve">Interface</w:t>
+            </w:r>
+          </w:p>
+        </w:tc>
+        <w:tc>
+          <w:tcPr>
+            <w:tcW w:w="4200" w:type="dxa"/>
+          </w:tcPr>
+          <w:p>
+            <w:pPr>
+              <w:spacing w:before="40" w:after="40"/>
+            </w:pPr>
+            <w:r>
+              <w:t xml:space="preserve">MTE Offline labor payroll override section</w:t>
+            </w:r>
+          </w:p>
+        </w:tc>
+      </w:tr>
+      <w:tr>
+        <w:tc>
+          <w:tcPr>
+            <w:tcW w:w="3600" w:type="dxa"/>
+          </w:tcPr>
+          <w:p>
+            <w:pPr>
+              <w:spacing w:before="40" w:after="40"/>
+            </w:pPr>
+            <w:r>
+              <w:t xml:space="preserve">ATE Manage MTE Offline App</w:t>
+            </w:r>
+          </w:p>
+        </w:tc>
+        <w:tc>
+          <w:tcPr>
+            <w:tcW w:w="1560" w:type="dxa"/>
+          </w:tcPr>
+          <w:p>
+            <w:pPr>
+              <w:spacing w:before="40" w:after="40"/>
+            </w:pPr>
+            <w:r>
+              <w:t xml:space="preserve">Process Model</w:t>
+            </w:r>
+          </w:p>
+        </w:tc>
+        <w:tc>
+          <w:tcPr>
+            <w:tcW w:w="4200" w:type="dxa"/>
+          </w:tcPr>
+          <w:p>
+            <w:pPr>
+              <w:spacing w:before="40" w:after="40"/>
+            </w:pPr>
+            <w:r>
+              <w:t xml:space="preserve">Process model to manage the ATE for the application (Offline)</w:t>
+            </w:r>
+          </w:p>
+        </w:tc>
+      </w:tr>
+      <w:tr>
+        <w:tc>
+          <w:tcPr>
+            <w:tcW w:w="3600" w:type="dxa"/>
+          </w:tcPr>
+          <w:p>
+            <w:pPr>
+              <w:spacing w:before="40" w:after="40"/>
+            </w:pPr>
+            <w:r>
+              <w:t xml:space="preserve">ATE_RULE_buildOfflinePayrollOverrideByConfig</w:t>
+            </w:r>
+          </w:p>
+        </w:tc>
+        <w:tc>
+          <w:tcPr>
+            <w:tcW w:w="1560" w:type="dxa"/>
+          </w:tcPr>
+          <w:p>
+            <w:pPr>
+              <w:spacing w:before="40" w:after="40"/>
+            </w:pPr>
+            <w:r>
+              <w:t xml:space="preserve">Expression Rule</w:t>
+            </w:r>
+          </w:p>
+        </w:tc>
+        <w:tc>
+          <w:tcPr>
+            <w:tcW w:w="4200" w:type="dxa"/>
+          </w:tcPr>
+          <w:p>
+            <w:pPr>
+              <w:spacing w:before="40" w:after="40"/>
+            </w:pPr>
+            <w:r>
+              <w:t xml:space="preserve">Builds payroll override settings by configuration</w:t>
+            </w:r>
+          </w:p>
+        </w:tc>
+      </w:tr>
+    </w:tbl>
+    <w:p/>
     <w:sectPr>
       <w:pgSz w:w="12240" w:h="15840" w:orient="portrait"/>
       <w:pgMar w:top="1080" w:right="1440" w:bottom="1080" w:left="1440" w:header="708" w:footer="708" w:gutter="0"/>

</xml_diff>